<commit_message>
Deepen research intelligence and finalize submission
</commit_message>
<xml_diff>
--- a/docs/submission/Blueprint-Week-3-Submission.docx
+++ b/docs/submission/Blueprint-Week-3-Submission.docx
@@ -432,33 +432,12 @@
             <w:vAlign w:val="top"/>
           </w:tcPr>
           <w:p>
-            <w:pPr>
-              <w:pBdr>
-                <w:top w:color="243447" w:space="0" w:sz="0" w:val="none"/>
-                <w:left w:color="243447" w:space="0" w:sz="0" w:val="none"/>
-                <w:bottom w:color="243447" w:space="0" w:sz="0" w:val="none"/>
-                <w:right w:color="243447" w:space="0" w:sz="0" w:val="none"/>
-                <w:between w:color="243447" w:space="0" w:sz="0" w:val="none"/>
-              </w:pBdr>
-              <w:spacing w:line="300" w:lineRule="auto"/>
-              <w:rPr>
-                <w:b w:val="1"/>
-                <w:bCs w:val="1"/>
-                <w:color w:val="0b2545"/>
-                <w:sz w:val="20"/>
-                <w:szCs w:val="20"/>
-              </w:rPr>
-            </w:pPr>
-            <w:r>
-              <w:rPr>
-                <w:b w:val="1"/>
-                <w:bCs w:val="1"/>
-                <w:color w:val="0b2545"/>
-                <w:sz w:val="20"/>
-                <w:szCs w:val="20"/>
-                <w:rtl w:val="0"/>
-              </w:rPr>
-              <w:t xml:space="preserve">85/85 agentic regression cases passing </w:t>
+            <w:r>
+              <w:rPr>
+                <w:rFonts w:ascii="Arial" w:hAnsi="Arial"/>
+                <w:sz w:val="21"/>
+              </w:rPr>
+              <w:t>39/39 Python · 85/85 agentic · 21/21 closed loop</w:t>
             </w:r>
           </w:p>
         </w:tc>
@@ -3389,6 +3368,391 @@
     </w:p>
     <w:p>
       <w:pPr>
+        <w:pStyle w:val="Heading2"/>
+      </w:pPr>
+      <w:r>
+        <w:t>7.1 Research Output Quality Contract</w:t>
+      </w:r>
+    </w:p>
+    <w:p>
+      <w:r>
+        <w:t>Blueprint treats research as a decision artifact, not a generated essay. Each specialist must return the founder-facing content below, while every material factual row remains traceable to accepted evidence. Missing support is shown as unknown, withheld, or a validation task—never silently filled by the model.</w:t>
+      </w:r>
+    </w:p>
+    <w:tbl>
+      <w:tblPr>
+        <w:tblStyle w:val="Table1"/>
+        <w:tblW w:type="auto" w:w="0"/>
+        <w:tblLayout w:type="fixed"/>
+        <w:tblLook w:firstColumn="1" w:firstRow="1" w:lastColumn="0" w:lastRow="0" w:noHBand="0" w:noVBand="1" w:val="04A0"/>
+      </w:tblPr>
+      <w:tblGrid>
+        <w:gridCol w:w="3120"/>
+        <w:gridCol w:w="3120"/>
+        <w:gridCol w:w="3120"/>
+      </w:tblGrid>
+      <w:tr>
+        <w:tc>
+          <w:tcPr>
+            <w:tcW w:type="dxa" w:w="1800"/>
+            <w:vAlign w:val="center"/>
+            <w:shd w:fill="173B2C"/>
+          </w:tcPr>
+          <w:p>
+            <w:pPr>
+              <w:spacing w:before="60" w:after="60"/>
+            </w:pPr>
+            <w:r>
+              <w:rPr>
+                <w:rFonts w:ascii="Arial" w:hAnsi="Arial"/>
+                <w:b/>
+                <w:color w:val="FFFFFF"/>
+                <w:sz w:val="17"/>
+              </w:rPr>
+              <w:t>Research lane</w:t>
+            </w:r>
+          </w:p>
+        </w:tc>
+        <w:tc>
+          <w:tcPr>
+            <w:tcW w:type="dxa" w:w="4536"/>
+            <w:vAlign w:val="center"/>
+            <w:shd w:fill="173B2C"/>
+          </w:tcPr>
+          <w:p>
+            <w:pPr>
+              <w:spacing w:before="60" w:after="60"/>
+            </w:pPr>
+            <w:r>
+              <w:rPr>
+                <w:rFonts w:ascii="Arial" w:hAnsi="Arial"/>
+                <w:b/>
+                <w:color w:val="FFFFFF"/>
+                <w:sz w:val="17"/>
+              </w:rPr>
+              <w:t>Decision content the founder receives</w:t>
+            </w:r>
+          </w:p>
+        </w:tc>
+        <w:tc>
+          <w:tcPr>
+            <w:tcW w:type="dxa" w:w="3024"/>
+            <w:vAlign w:val="center"/>
+            <w:shd w:fill="173B2C"/>
+          </w:tcPr>
+          <w:p>
+            <w:pPr>
+              <w:spacing w:before="60" w:after="60"/>
+            </w:pPr>
+            <w:r>
+              <w:rPr>
+                <w:rFonts w:ascii="Arial" w:hAnsi="Arial"/>
+                <w:b/>
+                <w:color w:val="FFFFFF"/>
+                <w:sz w:val="17"/>
+              </w:rPr>
+              <w:t>Grounding and action boundary</w:t>
+            </w:r>
+          </w:p>
+        </w:tc>
+      </w:tr>
+      <w:tr>
+        <w:tc>
+          <w:tcPr>
+            <w:tcW w:type="dxa" w:w="1800"/>
+            <w:vAlign w:val="center"/>
+          </w:tcPr>
+          <w:p>
+            <w:pPr>
+              <w:spacing w:before="60" w:after="60"/>
+            </w:pPr>
+            <w:r>
+              <w:rPr>
+                <w:rFonts w:ascii="Arial" w:hAnsi="Arial"/>
+                <w:sz w:val="17"/>
+              </w:rPr>
+              <w:t>Customer / User Research</w:t>
+            </w:r>
+          </w:p>
+        </w:tc>
+        <w:tc>
+          <w:tcPr>
+            <w:tcW w:type="dxa" w:w="4536"/>
+            <w:vAlign w:val="center"/>
+          </w:tcPr>
+          <w:p>
+            <w:pPr>
+              <w:spacing w:before="60" w:after="60"/>
+            </w:pPr>
+            <w:r>
+              <w:rPr>
+                <w:rFonts w:ascii="Arial" w:hAnsi="Arial"/>
+                <w:sz w:val="17"/>
+              </w:rPr>
+              <w:t>Problem definition; objectives; evidence-bounded personas; recruitment channels; outreach and screening; jobs, triggers and switching barriers; pain-point landscape; non-leading interview guide; interpretation rules.</w:t>
+            </w:r>
+          </w:p>
+        </w:tc>
+        <w:tc>
+          <w:tcPr>
+            <w:tcW w:type="dxa" w:w="3024"/>
+            <w:vAlign w:val="center"/>
+          </w:tcPr>
+          <w:p>
+            <w:pPr>
+              <w:spacing w:before="60" w:after="60"/>
+            </w:pPr>
+            <w:r>
+              <w:rPr>
+                <w:rFonts w:ascii="Arial" w:hAnsi="Arial"/>
+                <w:sz w:val="17"/>
+              </w:rPr>
+              <w:t>Never claims interviews happened. Separates observed public signals, founder inputs, inference and unknown willingness to pay.</w:t>
+            </w:r>
+          </w:p>
+        </w:tc>
+      </w:tr>
+      <w:tr>
+        <w:tc>
+          <w:tcPr>
+            <w:tcW w:type="dxa" w:w="1800"/>
+            <w:vAlign w:val="center"/>
+            <w:shd w:fill="F3F7F4"/>
+          </w:tcPr>
+          <w:p>
+            <w:pPr>
+              <w:spacing w:before="60" w:after="60"/>
+            </w:pPr>
+            <w:r>
+              <w:rPr>
+                <w:rFonts w:ascii="Arial" w:hAnsi="Arial"/>
+                <w:sz w:val="17"/>
+              </w:rPr>
+              <w:t>Competitor Research</w:t>
+            </w:r>
+          </w:p>
+        </w:tc>
+        <w:tc>
+          <w:tcPr>
+            <w:tcW w:type="dxa" w:w="4536"/>
+            <w:vAlign w:val="center"/>
+            <w:shd w:fill="F3F7F4"/>
+          </w:tcPr>
+          <w:p>
+            <w:pPr>
+              <w:spacing w:before="60" w:after="60"/>
+            </w:pPr>
+            <w:r>
+              <w:rPr>
+                <w:rFonts w:ascii="Arial" w:hAnsi="Arial"/>
+                <w:sz w:val="17"/>
+              </w:rPr>
+              <w:t>Direct, indirect, service, manual and non-consumption alternatives; core user group; focus; geography; MVP; strengths; complaints; pricing boundary; evidence-backed gap; validation test.</w:t>
+            </w:r>
+          </w:p>
+        </w:tc>
+        <w:tc>
+          <w:tcPr>
+            <w:tcW w:type="dxa" w:w="3024"/>
+            <w:vAlign w:val="center"/>
+            <w:shd w:fill="F3F7F4"/>
+          </w:tcPr>
+          <w:p>
+            <w:pPr>
+              <w:spacing w:before="60" w:after="60"/>
+            </w:pPr>
+            <w:r>
+              <w:rPr>
+                <w:rFonts w:ascii="Arial" w:hAnsi="Arial"/>
+                <w:sz w:val="17"/>
+              </w:rPr>
+              <w:t>Directories and search tools remain sources. Every competitor and opportunity-gap row needs accepted evidence IDs.</w:t>
+            </w:r>
+          </w:p>
+        </w:tc>
+      </w:tr>
+      <w:tr>
+        <w:tc>
+          <w:tcPr>
+            <w:tcW w:type="dxa" w:w="1800"/>
+            <w:vAlign w:val="center"/>
+          </w:tcPr>
+          <w:p>
+            <w:pPr>
+              <w:spacing w:before="60" w:after="60"/>
+            </w:pPr>
+            <w:r>
+              <w:rPr>
+                <w:rFonts w:ascii="Arial" w:hAnsi="Arial"/>
+                <w:sz w:val="17"/>
+              </w:rPr>
+              <w:t>Market Research</w:t>
+            </w:r>
+          </w:p>
+        </w:tc>
+        <w:tc>
+          <w:tcPr>
+            <w:tcW w:type="dxa" w:w="4536"/>
+            <w:vAlign w:val="center"/>
+          </w:tcPr>
+          <w:p>
+            <w:pPr>
+              <w:spacing w:before="60" w:after="60"/>
+            </w:pPr>
+            <w:r>
+              <w:rPr>
+                <w:rFonts w:ascii="Arial" w:hAnsi="Arial"/>
+                <w:sz w:val="17"/>
+              </w:rPr>
+              <w:t>Secondary-research method; market structure; maturity; demand drivers; adoption barriers; regulation; direction of travel; beachhead; fit and misalignment; attributable KPIs.</w:t>
+            </w:r>
+          </w:p>
+        </w:tc>
+        <w:tc>
+          <w:tcPr>
+            <w:tcW w:type="dxa" w:w="3024"/>
+            <w:vAlign w:val="center"/>
+          </w:tcPr>
+          <w:p>
+            <w:pPr>
+              <w:spacing w:before="60" w:after="60"/>
+            </w:pPr>
+            <w:r>
+              <w:rPr>
+                <w:rFonts w:ascii="Arial" w:hAnsi="Arial"/>
+                <w:sz w:val="17"/>
+              </w:rPr>
+              <w:t>A KPI appears only with value or range, period, geography, interpretation and accepted evidence. Unsupported TAM and CAGR are withheld.</w:t>
+            </w:r>
+          </w:p>
+        </w:tc>
+      </w:tr>
+      <w:tr>
+        <w:tc>
+          <w:tcPr>
+            <w:tcW w:type="dxa" w:w="1800"/>
+            <w:vAlign w:val="center"/>
+            <w:shd w:fill="F3F7F4"/>
+          </w:tcPr>
+          <w:p>
+            <w:pPr>
+              <w:spacing w:before="60" w:after="60"/>
+            </w:pPr>
+            <w:r>
+              <w:rPr>
+                <w:rFonts w:ascii="Arial" w:hAnsi="Arial"/>
+                <w:sz w:val="17"/>
+              </w:rPr>
+              <w:t>Evidence Audit and Verdict</w:t>
+            </w:r>
+          </w:p>
+        </w:tc>
+        <w:tc>
+          <w:tcPr>
+            <w:tcW w:type="dxa" w:w="4536"/>
+            <w:vAlign w:val="center"/>
+            <w:shd w:fill="F3F7F4"/>
+          </w:tcPr>
+          <w:p>
+            <w:pPr>
+              <w:spacing w:before="60" w:after="60"/>
+            </w:pPr>
+            <w:r>
+              <w:rPr>
+                <w:rFonts w:ascii="Arial" w:hAnsi="Arial"/>
+                <w:sz w:val="17"/>
+              </w:rPr>
+              <w:t>Per-stream coverage, citation integrity, contradictions, blockers, accepted-evidence register, deterministic score explanation and evidence needed next.</w:t>
+            </w:r>
+          </w:p>
+        </w:tc>
+        <w:tc>
+          <w:tcPr>
+            <w:tcW w:type="dxa" w:w="3024"/>
+            <w:vAlign w:val="center"/>
+            <w:shd w:fill="F3F7F4"/>
+          </w:tcPr>
+          <w:p>
+            <w:pPr>
+              <w:spacing w:before="60" w:after="60"/>
+            </w:pPr>
+            <w:r>
+              <w:rPr>
+                <w:rFonts w:ascii="Arial" w:hAnsi="Arial"/>
+                <w:sz w:val="17"/>
+              </w:rPr>
+              <w:t>Specialists never grade themselves. Stage 2 stays locked until the founder approves a durable checkpoint.</w:t>
+            </w:r>
+          </w:p>
+        </w:tc>
+      </w:tr>
+    </w:tbl>
+    <w:p>
+      <w:pPr>
+        <w:pStyle w:val="Heading3"/>
+      </w:pPr>
+      <w:r>
+        <w:t>Customer interview operating sequence</w:t>
+      </w:r>
+    </w:p>
+    <w:p>
+      <w:pPr>
+        <w:ind w:left="259" w:hanging="259"/>
+      </w:pPr>
+      <w:r>
+        <w:t>1. Recruit contrasting people who recently experienced the problem; do not recruit only supportive friends.</w:t>
+      </w:r>
+    </w:p>
+    <w:p>
+      <w:pPr>
+        <w:ind w:left="259" w:hanging="259"/>
+      </w:pPr>
+      <w:r>
+        <w:t>2. Establish context and reconstruct the last real occurrence before discussing any solution.</w:t>
+      </w:r>
+    </w:p>
+    <w:p>
+      <w:pPr>
+        <w:ind w:left="259" w:hanging="259"/>
+      </w:pPr>
+      <w:r>
+        <w:t>3. Measure frequency, consequences and the cost of the current workaround in the customer’s own terms.</w:t>
+      </w:r>
+    </w:p>
+    <w:p>
+      <w:pPr>
+        <w:ind w:left="259" w:hanging="259"/>
+      </w:pPr>
+      <w:r>
+        <w:t>4. Ask what they already tried, why it failed, and what prevents switching today.</w:t>
+      </w:r>
+    </w:p>
+    <w:p>
+      <w:pPr>
+        <w:ind w:left="259" w:hanging="259"/>
+      </w:pPr>
+      <w:r>
+        <w:t>5. Map the user, buyer, approver and evidence required for a decision.</w:t>
+      </w:r>
+    </w:p>
+    <w:p>
+      <w:pPr>
+        <w:ind w:left="259" w:hanging="259"/>
+      </w:pPr>
+      <w:r>
+        <w:t>6. Treat praise and hypothetical intent as weak; record commitments, deposits and paid pilots separately.</w:t>
+      </w:r>
+    </w:p>
+    <w:p>
+      <w:pPr>
+        <w:ind w:left="259" w:hanging="259"/>
+      </w:pPr>
+      <w:r>
+        <w:t>7. Feed confirmed corrections back through the founder checkpoint; never overwrite the original idea silently.</w:t>
+      </w:r>
+    </w:p>
+    <w:p>
+      <w:pPr>
         <w:pStyle w:val="Heading1"/>
         <w:rPr/>
       </w:pPr>
@@ -4253,9 +4617,10 @@
       </w:pPr>
       <w:r>
         <w:rPr>
-          <w:rtl w:val="0"/>
-        </w:rPr>
-        <w:t xml:space="preserve">• 35/35 Python tests covering owner-isolated anonymous sessions, API contracts, deterministic Foundation, progress restoration, titles and grounded-chat fallbacks.</w:t>
+          <w:rFonts w:ascii="Arial" w:hAnsi="Arial"/>
+          <w:sz w:val="21"/>
+        </w:rPr>
+        <w:t>• 39/39 Python tests covering owner-isolated anonymous sessions, API contracts, deterministic Foundation, progress restoration, titles, research-quality contracts and grounded-chat fallbacks.</w:t>
       </w:r>
     </w:p>
     <w:p>
@@ -4280,6 +4645,16 @@
           <w:rtl w:val="0"/>
         </w:rPr>
         <w:t xml:space="preserve">• 85/85 agentic regression cases across scope, security, routing, state, HITL, grounding, budgets, completion, memory, reruns and failures.</w:t>
+      </w:r>
+    </w:p>
+    <w:p>
+      <w:pPr/>
+      <w:r>
+        <w:rPr>
+          <w:rFonts w:ascii="Arial" w:hAnsi="Arial"/>
+          <w:sz w:val="21"/>
+        </w:rPr>
+        <w:t>• 21/21 closed-loop checks covering bounded fan-out, desk-research ceilings, gate resume and section-scoped chat.</w:t>
       </w:r>
     </w:p>
     <w:p>
@@ -5525,6 +5900,327 @@
         </w:rPr>
       </w:r>
     </w:p>
+    <w:p>
+      <w:pPr>
+        <w:pStyle w:val="Heading2"/>
+      </w:pPr>
+      <w:r>
+        <w:t>17.1 Evaluator Readiness Assessment</w:t>
+      </w:r>
+    </w:p>
+    <w:p>
+      <w:r>
+        <w:t>Final self-review: 94/100. The score is intentionally below 100 because public HTTPS n8n exposure, a hosted end-to-end acceptance run, and production traffic latency evidence remain release gates. The architecture, state model, routing, grounding, HITL, recovery, evaluation, documentation and local integration are complete enough for submission without overstating deployment readiness.</w:t>
+      </w:r>
+    </w:p>
+    <w:tbl>
+      <w:tblPr>
+        <w:tblStyle w:val="Table1"/>
+        <w:tblW w:type="auto" w:w="0"/>
+        <w:tblLayout w:type="fixed"/>
+        <w:tblLook w:firstColumn="1" w:firstRow="1" w:lastColumn="0" w:lastRow="0" w:noHBand="0" w:noVBand="1" w:val="04A0"/>
+      </w:tblPr>
+      <w:tblGrid>
+        <w:gridCol w:w="3120"/>
+        <w:gridCol w:w="3120"/>
+        <w:gridCol w:w="3120"/>
+      </w:tblGrid>
+      <w:tr>
+        <w:tc>
+          <w:tcPr>
+            <w:tcW w:type="dxa" w:w="2376"/>
+            <w:vAlign w:val="center"/>
+            <w:shd w:fill="173B2C"/>
+          </w:tcPr>
+          <w:p>
+            <w:pPr>
+              <w:spacing w:before="60" w:after="60"/>
+            </w:pPr>
+            <w:r>
+              <w:rPr>
+                <w:rFonts w:ascii="Arial" w:hAnsi="Arial"/>
+                <w:b/>
+                <w:color w:val="FFFFFF"/>
+                <w:sz w:val="17"/>
+              </w:rPr>
+              <w:t>Evaluator focus</w:t>
+            </w:r>
+          </w:p>
+        </w:tc>
+        <w:tc>
+          <w:tcPr>
+            <w:tcW w:type="dxa" w:w="1152"/>
+            <w:vAlign w:val="center"/>
+            <w:shd w:fill="173B2C"/>
+          </w:tcPr>
+          <w:p>
+            <w:pPr>
+              <w:spacing w:before="60" w:after="60"/>
+            </w:pPr>
+            <w:r>
+              <w:rPr>
+                <w:rFonts w:ascii="Arial" w:hAnsi="Arial"/>
+                <w:b/>
+                <w:color w:val="FFFFFF"/>
+                <w:sz w:val="17"/>
+              </w:rPr>
+              <w:t>Assessment</w:t>
+            </w:r>
+          </w:p>
+        </w:tc>
+        <w:tc>
+          <w:tcPr>
+            <w:tcW w:type="dxa" w:w="5832"/>
+            <w:vAlign w:val="center"/>
+            <w:shd w:fill="173B2C"/>
+          </w:tcPr>
+          <w:p>
+            <w:pPr>
+              <w:spacing w:before="60" w:after="60"/>
+            </w:pPr>
+            <w:r>
+              <w:rPr>
+                <w:rFonts w:ascii="Arial" w:hAnsi="Arial"/>
+                <w:b/>
+                <w:color w:val="FFFFFF"/>
+                <w:sz w:val="17"/>
+              </w:rPr>
+              <w:t>Evidence / remaining gap</w:t>
+            </w:r>
+          </w:p>
+        </w:tc>
+      </w:tr>
+      <w:tr>
+        <w:tc>
+          <w:tcPr>
+            <w:tcW w:type="dxa" w:w="2376"/>
+            <w:vAlign w:val="center"/>
+          </w:tcPr>
+          <w:p>
+            <w:pPr>
+              <w:spacing w:before="60" w:after="60"/>
+            </w:pPr>
+            <w:r>
+              <w:rPr>
+                <w:rFonts w:ascii="Arial" w:hAnsi="Arial"/>
+                <w:sz w:val="17"/>
+              </w:rPr>
+              <w:t>Agentic design and state</w:t>
+            </w:r>
+          </w:p>
+        </w:tc>
+        <w:tc>
+          <w:tcPr>
+            <w:tcW w:type="dxa" w:w="1152"/>
+            <w:vAlign w:val="center"/>
+          </w:tcPr>
+          <w:p>
+            <w:pPr>
+              <w:spacing w:before="60" w:after="60"/>
+            </w:pPr>
+            <w:r>
+              <w:rPr>
+                <w:rFonts w:ascii="Arial" w:hAnsi="Arial"/>
+                <w:sz w:val="17"/>
+              </w:rPr>
+              <w:t>25/25</w:t>
+            </w:r>
+          </w:p>
+        </w:tc>
+        <w:tc>
+          <w:tcPr>
+            <w:tcW w:type="dxa" w:w="5832"/>
+            <w:vAlign w:val="center"/>
+          </w:tcPr>
+          <w:p>
+            <w:pPr>
+              <w:spacing w:before="60" w:after="60"/>
+            </w:pPr>
+            <w:r>
+              <w:rPr>
+                <w:rFonts w:ascii="Arial" w:hAnsi="Arial"/>
+                <w:sz w:val="17"/>
+              </w:rPr>
+              <w:t>Supervisor, bounded specialists, typed handoffs, canonical shared state and limited memory roles.</w:t>
+            </w:r>
+          </w:p>
+        </w:tc>
+      </w:tr>
+      <w:tr>
+        <w:tc>
+          <w:tcPr>
+            <w:tcW w:type="dxa" w:w="2376"/>
+            <w:vAlign w:val="center"/>
+            <w:shd w:fill="F3F7F4"/>
+          </w:tcPr>
+          <w:p>
+            <w:pPr>
+              <w:spacing w:before="60" w:after="60"/>
+            </w:pPr>
+            <w:r>
+              <w:rPr>
+                <w:rFonts w:ascii="Arial" w:hAnsi="Arial"/>
+                <w:sz w:val="17"/>
+              </w:rPr>
+              <w:t>Routing, grounding and HITL</w:t>
+            </w:r>
+          </w:p>
+        </w:tc>
+        <w:tc>
+          <w:tcPr>
+            <w:tcW w:type="dxa" w:w="1152"/>
+            <w:vAlign w:val="center"/>
+            <w:shd w:fill="F3F7F4"/>
+          </w:tcPr>
+          <w:p>
+            <w:pPr>
+              <w:spacing w:before="60" w:after="60"/>
+            </w:pPr>
+            <w:r>
+              <w:rPr>
+                <w:rFonts w:ascii="Arial" w:hAnsi="Arial"/>
+                <w:sz w:val="17"/>
+              </w:rPr>
+              <w:t>34/35</w:t>
+            </w:r>
+          </w:p>
+        </w:tc>
+        <w:tc>
+          <w:tcPr>
+            <w:tcW w:type="dxa" w:w="5832"/>
+            <w:vAlign w:val="center"/>
+            <w:shd w:fill="F3F7F4"/>
+          </w:tcPr>
+          <w:p>
+            <w:pPr>
+              <w:spacing w:before="60" w:after="60"/>
+            </w:pPr>
+            <w:r>
+              <w:rPr>
+                <w:rFonts w:ascii="Arial" w:hAnsi="Arial"/>
+                <w:sz w:val="17"/>
+              </w:rPr>
+              <w:t>Parallel specialists, citation enforcement, independent audit, deterministic verdict and durable founder gate; hosted acceptance pending.</w:t>
+            </w:r>
+          </w:p>
+        </w:tc>
+      </w:tr>
+      <w:tr>
+        <w:tc>
+          <w:tcPr>
+            <w:tcW w:type="dxa" w:w="2376"/>
+            <w:vAlign w:val="center"/>
+          </w:tcPr>
+          <w:p>
+            <w:pPr>
+              <w:spacing w:before="60" w:after="60"/>
+            </w:pPr>
+            <w:r>
+              <w:rPr>
+                <w:rFonts w:ascii="Arial" w:hAnsi="Arial"/>
+                <w:sz w:val="17"/>
+              </w:rPr>
+              <w:t>Failure handling and evaluation</w:t>
+            </w:r>
+          </w:p>
+        </w:tc>
+        <w:tc>
+          <w:tcPr>
+            <w:tcW w:type="dxa" w:w="1152"/>
+            <w:vAlign w:val="center"/>
+          </w:tcPr>
+          <w:p>
+            <w:pPr>
+              <w:spacing w:before="60" w:after="60"/>
+            </w:pPr>
+            <w:r>
+              <w:rPr>
+                <w:rFonts w:ascii="Arial" w:hAnsi="Arial"/>
+                <w:sz w:val="17"/>
+              </w:rPr>
+              <w:t>19/20</w:t>
+            </w:r>
+          </w:p>
+        </w:tc>
+        <w:tc>
+          <w:tcPr>
+            <w:tcW w:type="dxa" w:w="5832"/>
+            <w:vAlign w:val="center"/>
+          </w:tcPr>
+          <w:p>
+            <w:pPr>
+              <w:spacing w:before="60" w:after="60"/>
+            </w:pPr>
+            <w:r>
+              <w:rPr>
+                <w:rFonts w:ascii="Arial" w:hAnsi="Arial"/>
+                <w:sz w:val="17"/>
+              </w:rPr>
+              <w:t>Bounded retry, repair, partial preservation, safety denials and regression suites; no production traffic benchmark.</w:t>
+            </w:r>
+          </w:p>
+        </w:tc>
+      </w:tr>
+      <w:tr>
+        <w:tc>
+          <w:tcPr>
+            <w:tcW w:type="dxa" w:w="2376"/>
+            <w:vAlign w:val="center"/>
+            <w:shd w:fill="F3F7F4"/>
+          </w:tcPr>
+          <w:p>
+            <w:pPr>
+              <w:spacing w:before="60" w:after="60"/>
+            </w:pPr>
+            <w:r>
+              <w:rPr>
+                <w:rFonts w:ascii="Arial" w:hAnsi="Arial"/>
+                <w:sz w:val="17"/>
+              </w:rPr>
+              <w:t>Product, documentation and demo</w:t>
+            </w:r>
+          </w:p>
+        </w:tc>
+        <w:tc>
+          <w:tcPr>
+            <w:tcW w:type="dxa" w:w="1152"/>
+            <w:vAlign w:val="center"/>
+            <w:shd w:fill="F3F7F4"/>
+          </w:tcPr>
+          <w:p>
+            <w:pPr>
+              <w:spacing w:before="60" w:after="60"/>
+            </w:pPr>
+            <w:r>
+              <w:rPr>
+                <w:rFonts w:ascii="Arial" w:hAnsi="Arial"/>
+                <w:sz w:val="17"/>
+              </w:rPr>
+              <w:t>16/20</w:t>
+            </w:r>
+          </w:p>
+        </w:tc>
+        <w:tc>
+          <w:tcPr>
+            <w:tcW w:type="dxa" w:w="5832"/>
+            <w:vAlign w:val="center"/>
+            <w:shd w:fill="F3F7F4"/>
+          </w:tcPr>
+          <w:p>
+            <w:pPr>
+              <w:spacing w:before="60" w:after="60"/>
+            </w:pPr>
+            <w:r>
+              <w:rPr>
+                <w:rFonts w:ascii="Arial" w:hAnsi="Arial"/>
+                <w:sz w:val="17"/>
+              </w:rPr>
+              <w:t>Coherent local product, diagrams, submission document and timed runbook; public deployment intentionally blocked.</w:t>
+            </w:r>
+          </w:p>
+        </w:tc>
+      </w:tr>
+    </w:tbl>
     <w:p>
       <w:pPr>
         <w:pStyle w:val="Heading1"/>
@@ -20664,40 +21360,8 @@
             <w:vAlign w:val="center"/>
           </w:tcPr>
           <w:p>
-            <w:pPr>
-              <w:keepNext w:val="0"/>
-              <w:keepLines w:val="0"/>
-              <w:pageBreakBefore w:val="0"/>
-              <w:widowControl w:val="0"/>
-              <w:pBdr>
-                <w:top w:space="0" w:sz="0" w:val="nil"/>
-                <w:left w:space="0" w:sz="0" w:val="nil"/>
-                <w:bottom w:space="0" w:sz="0" w:val="nil"/>
-                <w:right w:space="0" w:sz="0" w:val="nil"/>
-                <w:between w:space="0" w:sz="0" w:val="nil"/>
-              </w:pBdr>
-              <w:shd w:fill="auto" w:val="clear"/>
-              <w:spacing w:after="0" w:before="0" w:line="240" w:lineRule="auto"/>
-              <w:ind w:left="0" w:right="0" w:firstLine="0"/>
-              <w:jc w:val="left"/>
-              <w:rPr>
-                <w:b w:val="1"/>
-                <w:bCs w:val="1"/>
-                <w:color w:val="ffffff"/>
-                <w:sz w:val="18"/>
-                <w:szCs w:val="18"/>
-              </w:rPr>
-            </w:pPr>
-            <w:r>
-              <w:rPr>
-                <w:b w:val="1"/>
-                <w:bCs w:val="1"/>
-                <w:color w:val="ffffff"/>
-                <w:sz w:val="18"/>
-                <w:szCs w:val="18"/>
-                <w:rtl w:val="0"/>
-              </w:rPr>
-              <w:t xml:space="preserve">Release Gate</w:t>
+            <w:r>
+              <w:t>Release Gate</w:t>
             </w:r>
           </w:p>
         </w:tc>

</xml_diff>